<commit_message>
Report Updated and Resource Added
</commit_message>
<xml_diff>
--- a/Software Specification and Design.docx
+++ b/Software Specification and Design.docx
@@ -2594,25 +2594,7 @@
           <w:sz w:val="22"/>
           <w:szCs w:val="22"/>
         </w:rPr>
-        <w:t xml:space="preserve">As part of the </w:t>
-      </w:r>
-      <w:proofErr w:type="gramStart"/>
-      <w:r>
-        <w:rPr>
-          <w:rFonts w:ascii="Calibri" w:hAnsi="Calibri" w:cs="Calibri"/>
-          <w:sz w:val="22"/>
-          <w:szCs w:val="22"/>
-        </w:rPr>
-        <w:t>Master's</w:t>
-      </w:r>
-      <w:proofErr w:type="gramEnd"/>
-      <w:r>
-        <w:rPr>
-          <w:rFonts w:ascii="Calibri" w:hAnsi="Calibri" w:cs="Calibri"/>
-          <w:sz w:val="22"/>
-          <w:szCs w:val="22"/>
-        </w:rPr>
-        <w:t xml:space="preserve"> program in Software Engineering for Industrial Applications at Hof University of Applied Sciences, students are required to apply theoretical knowledge in a practical industrial environment through project-based work. This report documents the software specification and design activities performed during the development of an AI-powered Retrieval-Augmented Generation (RAG) system for enterprise document management and knowledge retrieval.</w:t>
+        <w:t>As part of the Master's program in Software Engineering for Industrial Applications at Hof University of Applied Sciences, students are required to apply theoretical knowledge in a practical industrial environment through project-based work. This report documents the software specification and design activities performed during the development of an AI-powered Retrieval-Augmented Generation (RAG) system for enterprise document management and knowledge retrieval.</w:t>
       </w:r>
     </w:p>
     <w:p>
@@ -4807,25 +4789,7 @@
           <w:szCs w:val="22"/>
         </w:rPr>
         <w:lastRenderedPageBreak/>
-        <w:t xml:space="preserve">question, the same embedding process is applied to the query. The generated query embedding is then compared with the stored document </w:t>
-      </w:r>
-      <w:proofErr w:type="gramStart"/>
-      <w:r>
-        <w:rPr>
-          <w:rFonts w:ascii="Calibri" w:hAnsi="Calibri" w:cs="Calibri"/>
-          <w:sz w:val="22"/>
-          <w:szCs w:val="22"/>
-        </w:rPr>
-        <w:t>embeddings</w:t>
-      </w:r>
-      <w:proofErr w:type="gramEnd"/>
-      <w:r>
-        <w:rPr>
-          <w:rFonts w:ascii="Calibri" w:hAnsi="Calibri" w:cs="Calibri"/>
-          <w:sz w:val="22"/>
-          <w:szCs w:val="22"/>
-        </w:rPr>
-        <w:t xml:space="preserve"> to identify the most relevant document sections.</w:t>
+        <w:t>question, the same embedding process is applied to the query. The generated query embedding is then compared with the stored document embeddings to identify the most relevant document sections.</w:t>
       </w:r>
     </w:p>
     <w:p>
@@ -4953,25 +4917,7 @@
           <w:sz w:val="22"/>
           <w:szCs w:val="22"/>
         </w:rPr>
-        <w:t xml:space="preserve">Tailwind CSS was used to design the user interface of the application. Its utility-first approach allowed responsive and consistent user interfaces to be developed efficiently while minimizing the amount of </w:t>
-      </w:r>
-      <w:proofErr w:type="gramStart"/>
-      <w:r>
-        <w:rPr>
-          <w:rFonts w:ascii="Calibri" w:hAnsi="Calibri" w:cs="Calibri"/>
-          <w:sz w:val="22"/>
-          <w:szCs w:val="22"/>
-        </w:rPr>
-        <w:t>custom CSS required</w:t>
-      </w:r>
-      <w:proofErr w:type="gramEnd"/>
-      <w:r>
-        <w:rPr>
-          <w:rFonts w:ascii="Calibri" w:hAnsi="Calibri" w:cs="Calibri"/>
-          <w:sz w:val="22"/>
-          <w:szCs w:val="22"/>
-        </w:rPr>
-        <w:t>.</w:t>
+        <w:t>Tailwind CSS was used to design the user interface of the application. Its utility-first approach allowed responsive and consistent user interfaces to be developed efficiently while minimizing the amount of custom CSS required.</w:t>
       </w:r>
     </w:p>
     <w:p>
@@ -5292,43 +5238,7 @@
           <w:sz w:val="22"/>
           <w:szCs w:val="22"/>
         </w:rPr>
-        <w:t xml:space="preserve">Processing uploaded documents involves several computationally intensive operations, including text extraction, preprocessing, document chunking, embedding generation, and indexing. Executing </w:t>
-      </w:r>
-      <w:proofErr w:type="gramStart"/>
-      <w:r>
-        <w:rPr>
-          <w:rFonts w:ascii="Calibri" w:hAnsi="Calibri" w:cs="Calibri"/>
-          <w:sz w:val="22"/>
-          <w:szCs w:val="22"/>
-        </w:rPr>
-        <w:t>all of</w:t>
-      </w:r>
-      <w:proofErr w:type="gramEnd"/>
-      <w:r>
-        <w:rPr>
-          <w:rFonts w:ascii="Calibri" w:hAnsi="Calibri" w:cs="Calibri"/>
-          <w:sz w:val="22"/>
-          <w:szCs w:val="22"/>
-        </w:rPr>
-        <w:t xml:space="preserve"> these tasks immediately after </w:t>
-      </w:r>
-      <w:proofErr w:type="gramStart"/>
-      <w:r>
-        <w:rPr>
-          <w:rFonts w:ascii="Calibri" w:hAnsi="Calibri" w:cs="Calibri"/>
-          <w:sz w:val="22"/>
-          <w:szCs w:val="22"/>
-        </w:rPr>
-        <w:t>upload</w:t>
-      </w:r>
-      <w:proofErr w:type="gramEnd"/>
-      <w:r>
-        <w:rPr>
-          <w:rFonts w:ascii="Calibri" w:hAnsi="Calibri" w:cs="Calibri"/>
-          <w:sz w:val="22"/>
-          <w:szCs w:val="22"/>
-        </w:rPr>
-        <w:t xml:space="preserve"> could reduce the responsiveness of the application.</w:t>
+        <w:t>Processing uploaded documents involves several computationally intensive operations, including text extraction, preprocessing, document chunking, embedding generation, and indexing. Executing all of these tasks immediately after upload could reduce the responsiveness of the application.</w:t>
       </w:r>
     </w:p>
     <w:p>
@@ -5979,25 +5889,7 @@
           <w:sz w:val="22"/>
           <w:szCs w:val="22"/>
         </w:rPr>
-        <w:t xml:space="preserve">The system </w:t>
-      </w:r>
-      <w:proofErr w:type="gramStart"/>
-      <w:r>
-        <w:rPr>
-          <w:rFonts w:ascii="Calibri" w:hAnsi="Calibri" w:cs="Calibri"/>
-          <w:sz w:val="22"/>
-          <w:szCs w:val="22"/>
-        </w:rPr>
-        <w:t>shall</w:t>
-      </w:r>
-      <w:proofErr w:type="gramEnd"/>
-      <w:r>
-        <w:rPr>
-          <w:rFonts w:ascii="Calibri" w:hAnsi="Calibri" w:cs="Calibri"/>
-          <w:sz w:val="22"/>
-          <w:szCs w:val="22"/>
-        </w:rPr>
-        <w:t xml:space="preserve"> provide secure user authentication to ensure that only authorized users can access the platform. Each authenticated user shall have access only to their own documents, conversations, and related resources. Administrative users shall be provided with additional privileges to manage users, monitor system activities, and perform administrative operations</w:t>
+        <w:t>The system shall provide secure user authentication to ensure that only authorized users can access the platform. Each authenticated user shall have access only to their own documents, conversations, and related resources. Administrative users shall be provided with additional privileges to manage users, monitor system activities, and perform administrative operations</w:t>
       </w:r>
       <w:r>
         <w:rPr>
@@ -6054,25 +5946,7 @@
           <w:sz w:val="22"/>
           <w:szCs w:val="22"/>
         </w:rPr>
-        <w:t xml:space="preserve">The </w:t>
-      </w:r>
-      <w:proofErr w:type="gramStart"/>
-      <w:r>
-        <w:rPr>
-          <w:rFonts w:ascii="Calibri" w:hAnsi="Calibri" w:cs="Calibri"/>
-          <w:sz w:val="22"/>
-          <w:szCs w:val="22"/>
-        </w:rPr>
-        <w:t>system shall</w:t>
-      </w:r>
-      <w:proofErr w:type="gramEnd"/>
-      <w:r>
-        <w:rPr>
-          <w:rFonts w:ascii="Calibri" w:hAnsi="Calibri" w:cs="Calibri"/>
-          <w:sz w:val="22"/>
-          <w:szCs w:val="22"/>
-        </w:rPr>
-        <w:t xml:space="preserve"> allow users to upload, view, organize, and delete supported documents through a user-friendly interface. Uploaded documents shall be stored securely and associated with the corresponding user account. The platform shall maintain metadata for each document, including its processing status, upload date, and other relevant information.</w:t>
+        <w:t>The system shall allow users to upload, view, organize, and delete supported documents through a user-friendly interface. Uploaded documents shall be stored securely and associated with the corresponding user account. The platform shall maintain metadata for each document, including its processing status, upload date, and other relevant information.</w:t>
       </w:r>
     </w:p>
     <w:p>
@@ -6189,25 +6063,7 @@
           <w:sz w:val="22"/>
           <w:szCs w:val="22"/>
         </w:rPr>
-        <w:t xml:space="preserve">The system shall retrieve the most relevant document content in response to user queries based on semantic similarity rather than exact keyword matching. This functionality </w:t>
-      </w:r>
-      <w:proofErr w:type="gramStart"/>
-      <w:r>
-        <w:rPr>
-          <w:rFonts w:ascii="Calibri" w:hAnsi="Calibri" w:cs="Calibri"/>
-          <w:sz w:val="22"/>
-          <w:szCs w:val="22"/>
-        </w:rPr>
-        <w:t>shall</w:t>
-      </w:r>
-      <w:proofErr w:type="gramEnd"/>
-      <w:r>
-        <w:rPr>
-          <w:rFonts w:ascii="Calibri" w:hAnsi="Calibri" w:cs="Calibri"/>
-          <w:sz w:val="22"/>
-          <w:szCs w:val="22"/>
-        </w:rPr>
-        <w:t xml:space="preserve"> enable users to locate relevant information even when different terminology is used in the uploaded documents.</w:t>
+        <w:t>The system shall retrieve the most relevant document content in response to user queries based on semantic similarity rather than exact keyword matching. This functionality shall enable users to locate relevant information even when different terminology is used in the uploaded documents.</w:t>
       </w:r>
     </w:p>
     <w:p>
@@ -6401,25 +6257,7 @@
           <w:sz w:val="22"/>
           <w:szCs w:val="22"/>
         </w:rPr>
-        <w:t xml:space="preserve">The system </w:t>
-      </w:r>
-      <w:proofErr w:type="gramStart"/>
-      <w:r>
-        <w:rPr>
-          <w:rFonts w:ascii="Calibri" w:hAnsi="Calibri" w:cs="Calibri"/>
-          <w:sz w:val="22"/>
-          <w:szCs w:val="22"/>
-        </w:rPr>
-        <w:t>shall</w:t>
-      </w:r>
-      <w:proofErr w:type="gramEnd"/>
-      <w:r>
-        <w:rPr>
-          <w:rFonts w:ascii="Calibri" w:hAnsi="Calibri" w:cs="Calibri"/>
-          <w:sz w:val="22"/>
-          <w:szCs w:val="22"/>
-        </w:rPr>
-        <w:t xml:space="preserve"> provide administrative capabilities for monitoring overall system usage and maintaining platform operations. Administrative users shall be able to supervise document processing activities, manage user accounts, monitor background jobs, and perform maintenance tasks necessary for reliable system operation.</w:t>
+        <w:t>The system shall provide administrative capabilities for monitoring overall system usage and maintaining platform operations. Administrative users shall be able to supervise document processing activities, manage user accounts, monitor background jobs, and perform maintenance tasks necessary for reliable system operation.</w:t>
       </w:r>
     </w:p>
     <w:p>
@@ -6544,25 +6382,7 @@
           <w:sz w:val="22"/>
           <w:szCs w:val="22"/>
         </w:rPr>
-        <w:t xml:space="preserve">The system </w:t>
-      </w:r>
-      <w:proofErr w:type="gramStart"/>
-      <w:r>
-        <w:rPr>
-          <w:rFonts w:ascii="Calibri" w:hAnsi="Calibri" w:cs="Calibri"/>
-          <w:sz w:val="22"/>
-          <w:szCs w:val="22"/>
-        </w:rPr>
-        <w:t>shall</w:t>
-      </w:r>
-      <w:proofErr w:type="gramEnd"/>
-      <w:r>
-        <w:rPr>
-          <w:rFonts w:ascii="Calibri" w:hAnsi="Calibri" w:cs="Calibri"/>
-          <w:sz w:val="22"/>
-          <w:szCs w:val="22"/>
-        </w:rPr>
-        <w:t xml:space="preserve"> be designed to accommodate increasing numbers of users, documents, and conversations without requiring significant architectural changes. The document processing workflow and retrieval mechanism should support future expansion, allowing additional computing resources or storage capacity to be incorporated as system demand grows.</w:t>
+        <w:t>The system shall be designed to accommodate increasing numbers of users, documents, and conversations without requiring significant architectural changes. The document processing workflow and retrieval mechanism should support future expansion, allowing additional computing resources or storage capacity to be incorporated as system demand grows.</w:t>
       </w:r>
     </w:p>
     <w:p>
@@ -6601,43 +6421,7 @@
           <w:sz w:val="22"/>
           <w:szCs w:val="22"/>
         </w:rPr>
-        <w:t xml:space="preserve">The platform shall ensure that user documents and conversations remain protected from unauthorized access. User authentication and authorization mechanisms shall restrict access to resources based on user roles. </w:t>
-      </w:r>
-      <w:proofErr w:type="gramStart"/>
-      <w:r>
-        <w:rPr>
-          <w:rFonts w:ascii="Calibri" w:hAnsi="Calibri" w:cs="Calibri"/>
-          <w:sz w:val="22"/>
-          <w:szCs w:val="22"/>
-        </w:rPr>
-        <w:t>Documents shall</w:t>
-      </w:r>
-      <w:proofErr w:type="gramEnd"/>
-      <w:r>
-        <w:rPr>
-          <w:rFonts w:ascii="Calibri" w:hAnsi="Calibri" w:cs="Calibri"/>
-          <w:sz w:val="22"/>
-          <w:szCs w:val="22"/>
-        </w:rPr>
-        <w:t xml:space="preserve"> remain isolated between users, ensuring that only authorized individuals can access their own uploaded content. Administrative operations </w:t>
-      </w:r>
-      <w:proofErr w:type="gramStart"/>
-      <w:r>
-        <w:rPr>
-          <w:rFonts w:ascii="Calibri" w:hAnsi="Calibri" w:cs="Calibri"/>
-          <w:sz w:val="22"/>
-          <w:szCs w:val="22"/>
-        </w:rPr>
-        <w:t>shall</w:t>
-      </w:r>
-      <w:proofErr w:type="gramEnd"/>
-      <w:r>
-        <w:rPr>
-          <w:rFonts w:ascii="Calibri" w:hAnsi="Calibri" w:cs="Calibri"/>
-          <w:sz w:val="22"/>
-          <w:szCs w:val="22"/>
-        </w:rPr>
-        <w:t xml:space="preserve"> be available only to users with appropriate privileges.</w:t>
+        <w:t>The platform shall ensure that user documents and conversations remain protected from unauthorized access. User authentication and authorization mechanisms shall restrict access to resources based on user roles. Documents shall remain isolated between users, ensuring that only authorized individuals can access their own uploaded content. Administrative operations shall be available only to users with appropriate privileges.</w:t>
       </w:r>
     </w:p>
     <w:p>
@@ -6676,43 +6460,7 @@
           <w:sz w:val="22"/>
           <w:szCs w:val="22"/>
         </w:rPr>
-        <w:t xml:space="preserve">The system </w:t>
-      </w:r>
-      <w:proofErr w:type="gramStart"/>
-      <w:r>
-        <w:rPr>
-          <w:rFonts w:ascii="Calibri" w:hAnsi="Calibri" w:cs="Calibri"/>
-          <w:sz w:val="22"/>
-          <w:szCs w:val="22"/>
-        </w:rPr>
-        <w:t>shall</w:t>
-      </w:r>
-      <w:proofErr w:type="gramEnd"/>
-      <w:r>
-        <w:rPr>
-          <w:rFonts w:ascii="Calibri" w:hAnsi="Calibri" w:cs="Calibri"/>
-          <w:sz w:val="22"/>
-          <w:szCs w:val="22"/>
-        </w:rPr>
-        <w:t xml:space="preserve"> provide reliable document processing and retrieval services under normal operating conditions. Background processing tasks should </w:t>
-      </w:r>
-      <w:proofErr w:type="gramStart"/>
-      <w:r>
-        <w:rPr>
-          <w:rFonts w:ascii="Calibri" w:hAnsi="Calibri" w:cs="Calibri"/>
-          <w:sz w:val="22"/>
-          <w:szCs w:val="22"/>
-        </w:rPr>
-        <w:t>execute</w:t>
-      </w:r>
-      <w:proofErr w:type="gramEnd"/>
-      <w:r>
-        <w:rPr>
-          <w:rFonts w:ascii="Calibri" w:hAnsi="Calibri" w:cs="Calibri"/>
-          <w:sz w:val="22"/>
-          <w:szCs w:val="22"/>
-        </w:rPr>
-        <w:t xml:space="preserve"> independently of user interactions, reducing the risk of interrupted operations. Appropriate error handling and status reporting shall be implemented to ensure that failures are detected, reported, and managed without affecting overall system stability.</w:t>
+        <w:t>The system shall provide reliable document processing and retrieval services under normal operating conditions. Background processing tasks should execute independently of user interactions, reducing the risk of interrupted operations. Appropriate error handling and status reporting shall be implemented to ensure that failures are detected, reported, and managed without affecting overall system stability.</w:t>
       </w:r>
     </w:p>
     <w:p>
@@ -6839,25 +6587,7 @@
           <w:sz w:val="22"/>
           <w:szCs w:val="22"/>
         </w:rPr>
-        <w:t xml:space="preserve">The system shall be developed using </w:t>
-      </w:r>
-      <w:proofErr w:type="gramStart"/>
-      <w:r>
-        <w:rPr>
-          <w:rFonts w:ascii="Calibri" w:hAnsi="Calibri" w:cs="Calibri"/>
-          <w:sz w:val="22"/>
-          <w:szCs w:val="22"/>
-        </w:rPr>
-        <w:t>a modular</w:t>
-      </w:r>
-      <w:proofErr w:type="gramEnd"/>
-      <w:r>
-        <w:rPr>
-          <w:rFonts w:ascii="Calibri" w:hAnsi="Calibri" w:cs="Calibri"/>
-          <w:sz w:val="22"/>
-          <w:szCs w:val="22"/>
-        </w:rPr>
-        <w:t xml:space="preserve"> software architecture to simplify future maintenance and feature enhancements. Individual components responsible for document processing, retrieval, conversation management, and administration shall remain loosely coupled, enabling modifications or extensions without significantly affecting other parts of the system. Clear project organization and documentation shall further support long-term maintainability.</w:t>
+        <w:t>The system shall be developed using a modular software architecture to simplify future maintenance and feature enhancements. Individual components responsible for document processing, retrieval, conversation management, and administration shall remain loosely coupled, enabling modifications or extensions without significantly affecting other parts of the system. Clear project organization and documentation shall further support long-term maintainability.</w:t>
       </w:r>
     </w:p>
     <w:p>
@@ -6896,43 +6626,7 @@
           <w:sz w:val="22"/>
           <w:szCs w:val="22"/>
         </w:rPr>
-        <w:t xml:space="preserve">The system shall support commonly used enterprise document formats and operate through modern web browsers without requiring additional client-side software. The application </w:t>
-      </w:r>
-      <w:proofErr w:type="gramStart"/>
-      <w:r>
-        <w:rPr>
-          <w:rFonts w:ascii="Calibri" w:hAnsi="Calibri" w:cs="Calibri"/>
-          <w:sz w:val="22"/>
-          <w:szCs w:val="22"/>
-        </w:rPr>
-        <w:t>shall</w:t>
-      </w:r>
-      <w:proofErr w:type="gramEnd"/>
-      <w:r>
-        <w:rPr>
-          <w:rFonts w:ascii="Calibri" w:hAnsi="Calibri" w:cs="Calibri"/>
-          <w:sz w:val="22"/>
-          <w:szCs w:val="22"/>
-        </w:rPr>
-        <w:t xml:space="preserve"> provide </w:t>
-      </w:r>
-      <w:proofErr w:type="gramStart"/>
-      <w:r>
-        <w:rPr>
-          <w:rFonts w:ascii="Calibri" w:hAnsi="Calibri" w:cs="Calibri"/>
-          <w:sz w:val="22"/>
-          <w:szCs w:val="22"/>
-        </w:rPr>
-        <w:t>a consistent</w:t>
-      </w:r>
-      <w:proofErr w:type="gramEnd"/>
-      <w:r>
-        <w:rPr>
-          <w:rFonts w:ascii="Calibri" w:hAnsi="Calibri" w:cs="Calibri"/>
-          <w:sz w:val="22"/>
-          <w:szCs w:val="22"/>
-        </w:rPr>
-        <w:t xml:space="preserve"> user experience across different desktop operating systems while maintaining compatibility with the underlying enterprise infrastructure.</w:t>
+        <w:t>The system shall support commonly used enterprise document formats and operate through modern web browsers without requiring additional client-side software. The application shall provide a consistent user experience across different desktop operating systems while maintaining compatibility with the underlying enterprise infrastructure.</w:t>
       </w:r>
     </w:p>
     <w:p>
@@ -7706,25 +7400,7 @@
           <w:sz w:val="22"/>
           <w:szCs w:val="22"/>
         </w:rPr>
-        <w:t xml:space="preserve">Users can view document details and </w:t>
-      </w:r>
-      <w:proofErr w:type="gramStart"/>
-      <w:r>
-        <w:rPr>
-          <w:rFonts w:ascii="Calibri" w:hAnsi="Calibri" w:cs="Calibri"/>
-          <w:sz w:val="22"/>
-          <w:szCs w:val="22"/>
-        </w:rPr>
-        <w:t>processing</w:t>
-      </w:r>
-      <w:proofErr w:type="gramEnd"/>
-      <w:r>
-        <w:rPr>
-          <w:rFonts w:ascii="Calibri" w:hAnsi="Calibri" w:cs="Calibri"/>
-          <w:sz w:val="22"/>
-          <w:szCs w:val="22"/>
-        </w:rPr>
-        <w:t xml:space="preserve"> information.</w:t>
+        <w:t>Users can view document details and processing information.</w:t>
       </w:r>
     </w:p>
     <w:p>
@@ -8506,25 +8182,7 @@
           <w:sz w:val="22"/>
           <w:szCs w:val="22"/>
         </w:rPr>
-        <w:t xml:space="preserve">References are displayed together with the </w:t>
-      </w:r>
-      <w:proofErr w:type="gramStart"/>
-      <w:r>
-        <w:rPr>
-          <w:rFonts w:ascii="Calibri" w:hAnsi="Calibri" w:cs="Calibri"/>
-          <w:sz w:val="22"/>
-          <w:szCs w:val="22"/>
-        </w:rPr>
-        <w:t>generated response</w:t>
-      </w:r>
-      <w:proofErr w:type="gramEnd"/>
-      <w:r>
-        <w:rPr>
-          <w:rFonts w:ascii="Calibri" w:hAnsi="Calibri" w:cs="Calibri"/>
-          <w:sz w:val="22"/>
-          <w:szCs w:val="22"/>
-        </w:rPr>
-        <w:t>.</w:t>
+        <w:t>References are displayed together with the generated response.</w:t>
       </w:r>
     </w:p>
     <w:p>
@@ -8947,6 +8605,7 @@
     </w:p>
     <w:p>
       <w:pPr>
+        <w:spacing w:after="0"/>
         <w:rPr>
           <w:rFonts w:ascii="Calibri" w:hAnsi="Calibri" w:cs="Calibri"/>
         </w:rPr>
@@ -9018,7 +8677,37 @@
           <w:sz w:val="20"/>
           <w:szCs w:val="20"/>
         </w:rPr>
-        <w:t>Figure 1: Use Case Diagram for the AI-powered Document Retrieval System</w:t>
+        <w:t xml:space="preserve">Figure </w:t>
+      </w:r>
+      <w:r>
+        <w:rPr>
+          <w:rFonts w:ascii="Calibri" w:hAnsi="Calibri" w:cs="Calibri"/>
+          <w:b/>
+          <w:bCs/>
+          <w:sz w:val="20"/>
+          <w:szCs w:val="20"/>
+        </w:rPr>
+        <w:t>5.</w:t>
+      </w:r>
+      <w:r>
+        <w:rPr>
+          <w:rFonts w:ascii="Calibri" w:hAnsi="Calibri" w:cs="Calibri"/>
+          <w:b/>
+          <w:bCs/>
+          <w:sz w:val="20"/>
+          <w:szCs w:val="20"/>
+        </w:rPr>
+        <w:t xml:space="preserve">1: </w:t>
+      </w:r>
+      <w:r>
+        <w:rPr>
+          <w:rFonts w:ascii="Calibri" w:hAnsi="Calibri" w:cs="Calibri"/>
+          <w:b/>
+          <w:bCs/>
+          <w:sz w:val="20"/>
+          <w:szCs w:val="20"/>
+        </w:rPr>
+        <w:t>Overall Use Case Diagram of the AI-powered Document Retrieval System</w:t>
       </w:r>
     </w:p>
     <w:p>
@@ -9158,23 +8847,13 @@
         </w:rPr>
         <w:t xml:space="preserve"> </w:t>
       </w:r>
-      <w:proofErr w:type="gramStart"/>
-      <w:r>
-        <w:rPr>
-          <w:rFonts w:ascii="Calibri" w:hAnsi="Calibri" w:cs="Calibri"/>
-          <w:sz w:val="22"/>
-          <w:szCs w:val="22"/>
-        </w:rPr>
-        <w:t>This use</w:t>
-      </w:r>
-      <w:proofErr w:type="gramEnd"/>
-      <w:r>
-        <w:rPr>
-          <w:rFonts w:ascii="Calibri" w:hAnsi="Calibri" w:cs="Calibri"/>
-          <w:sz w:val="22"/>
-          <w:szCs w:val="22"/>
-        </w:rPr>
-        <w:t xml:space="preserve"> case describes how a user or administrator logs in to the system to access the platform securely.</w:t>
+      <w:r>
+        <w:rPr>
+          <w:rFonts w:ascii="Calibri" w:hAnsi="Calibri" w:cs="Calibri"/>
+          <w:sz w:val="22"/>
+          <w:szCs w:val="22"/>
+        </w:rPr>
+        <w:t>This use case describes how a user or administrator logs in to the system to access the platform securely.</w:t>
       </w:r>
     </w:p>
     <w:p>
@@ -9777,25 +9456,7 @@
           <w:sz w:val="22"/>
           <w:szCs w:val="22"/>
         </w:rPr>
-        <w:t xml:space="preserve">The user </w:t>
-      </w:r>
-      <w:proofErr w:type="gramStart"/>
-      <w:r>
-        <w:rPr>
-          <w:rFonts w:ascii="Calibri" w:hAnsi="Calibri" w:cs="Calibri"/>
-          <w:sz w:val="22"/>
-          <w:szCs w:val="22"/>
-        </w:rPr>
-        <w:t>navigates to</w:t>
-      </w:r>
-      <w:proofErr w:type="gramEnd"/>
-      <w:r>
-        <w:rPr>
-          <w:rFonts w:ascii="Calibri" w:hAnsi="Calibri" w:cs="Calibri"/>
-          <w:sz w:val="22"/>
-          <w:szCs w:val="22"/>
-        </w:rPr>
-        <w:t xml:space="preserve"> the document upload page.</w:t>
+        <w:t>The user navigates to the document upload page.</w:t>
       </w:r>
     </w:p>
     <w:p>
@@ -10982,23 +10643,13 @@
         </w:rPr>
         <w:t xml:space="preserve"> </w:t>
       </w:r>
-      <w:proofErr w:type="gramStart"/>
-      <w:r>
-        <w:rPr>
-          <w:rFonts w:ascii="Calibri" w:hAnsi="Calibri" w:cs="Calibri"/>
-          <w:sz w:val="22"/>
-          <w:szCs w:val="22"/>
-        </w:rPr>
-        <w:t>This use</w:t>
-      </w:r>
-      <w:proofErr w:type="gramEnd"/>
-      <w:r>
-        <w:rPr>
-          <w:rFonts w:ascii="Calibri" w:hAnsi="Calibri" w:cs="Calibri"/>
-          <w:sz w:val="22"/>
-          <w:szCs w:val="22"/>
-        </w:rPr>
-        <w:t xml:space="preserve"> case describes how a user starts a new conversation by selecting one or more processed documents as the knowledge source.</w:t>
+      <w:r>
+        <w:rPr>
+          <w:rFonts w:ascii="Calibri" w:hAnsi="Calibri" w:cs="Calibri"/>
+          <w:sz w:val="22"/>
+          <w:szCs w:val="22"/>
+        </w:rPr>
+        <w:t>This use case describes how a user starts a new conversation by selecting one or more processed documents as the knowledge source.</w:t>
       </w:r>
     </w:p>
     <w:p>
@@ -11428,23 +11079,13 @@
         </w:rPr>
         <w:t xml:space="preserve"> </w:t>
       </w:r>
-      <w:proofErr w:type="gramStart"/>
-      <w:r>
-        <w:rPr>
-          <w:rFonts w:ascii="Calibri" w:hAnsi="Calibri" w:cs="Calibri"/>
-          <w:sz w:val="22"/>
-          <w:szCs w:val="22"/>
-        </w:rPr>
-        <w:t>This use</w:t>
-      </w:r>
-      <w:proofErr w:type="gramEnd"/>
-      <w:r>
-        <w:rPr>
-          <w:rFonts w:ascii="Calibri" w:hAnsi="Calibri" w:cs="Calibri"/>
-          <w:sz w:val="22"/>
-          <w:szCs w:val="22"/>
-        </w:rPr>
-        <w:t xml:space="preserve"> case describes how a user asks a natural language question and receives an answer based on the selected documents.</w:t>
+      <w:r>
+        <w:rPr>
+          <w:rFonts w:ascii="Calibri" w:hAnsi="Calibri" w:cs="Calibri"/>
+          <w:sz w:val="22"/>
+          <w:szCs w:val="22"/>
+        </w:rPr>
+        <w:t>This use case describes how a user asks a natural language question and receives an answer based on the selected documents.</w:t>
       </w:r>
     </w:p>
     <w:p>
@@ -11678,25 +11319,7 @@
           <w:sz w:val="22"/>
           <w:szCs w:val="22"/>
         </w:rPr>
-        <w:t xml:space="preserve">The system </w:t>
-      </w:r>
-      <w:proofErr w:type="gramStart"/>
-      <w:r>
-        <w:rPr>
-          <w:rFonts w:ascii="Calibri" w:hAnsi="Calibri" w:cs="Calibri"/>
-          <w:sz w:val="22"/>
-          <w:szCs w:val="22"/>
-        </w:rPr>
-        <w:t>searches</w:t>
-      </w:r>
-      <w:proofErr w:type="gramEnd"/>
-      <w:r>
-        <w:rPr>
-          <w:rFonts w:ascii="Calibri" w:hAnsi="Calibri" w:cs="Calibri"/>
-          <w:sz w:val="22"/>
-          <w:szCs w:val="22"/>
-        </w:rPr>
-        <w:t xml:space="preserve"> the selected document content.</w:t>
+        <w:t>The system searches the selected document content.</w:t>
       </w:r>
     </w:p>
     <w:p>
@@ -12241,25 +11864,7 @@
           <w:sz w:val="22"/>
           <w:szCs w:val="22"/>
         </w:rPr>
-        <w:t xml:space="preserve">The system generates </w:t>
-      </w:r>
-      <w:proofErr w:type="gramStart"/>
-      <w:r>
-        <w:rPr>
-          <w:rFonts w:ascii="Calibri" w:hAnsi="Calibri" w:cs="Calibri"/>
-          <w:sz w:val="22"/>
-          <w:szCs w:val="22"/>
-        </w:rPr>
-        <w:t>a response</w:t>
-      </w:r>
-      <w:proofErr w:type="gramEnd"/>
-      <w:r>
-        <w:rPr>
-          <w:rFonts w:ascii="Calibri" w:hAnsi="Calibri" w:cs="Calibri"/>
-          <w:sz w:val="22"/>
-          <w:szCs w:val="22"/>
-        </w:rPr>
-        <w:t xml:space="preserve"> using the retrieved information.</w:t>
+        <w:t>The system generates a response using the retrieved information.</w:t>
       </w:r>
     </w:p>
     <w:p>
@@ -12433,23 +12038,13 @@
         </w:rPr>
         <w:t xml:space="preserve"> </w:t>
       </w:r>
-      <w:proofErr w:type="gramStart"/>
-      <w:r>
-        <w:rPr>
-          <w:rFonts w:ascii="Calibri" w:hAnsi="Calibri" w:cs="Calibri"/>
-          <w:sz w:val="22"/>
-          <w:szCs w:val="22"/>
-        </w:rPr>
-        <w:t>This use</w:t>
-      </w:r>
-      <w:proofErr w:type="gramEnd"/>
-      <w:r>
-        <w:rPr>
-          <w:rFonts w:ascii="Calibri" w:hAnsi="Calibri" w:cs="Calibri"/>
-          <w:sz w:val="22"/>
-          <w:szCs w:val="22"/>
-        </w:rPr>
-        <w:t xml:space="preserve"> case describes how users view document references related to generated responses.</w:t>
+      <w:r>
+        <w:rPr>
+          <w:rFonts w:ascii="Calibri" w:hAnsi="Calibri" w:cs="Calibri"/>
+          <w:sz w:val="22"/>
+          <w:szCs w:val="22"/>
+        </w:rPr>
+        <w:t>This use case describes how users view document references related to generated responses.</w:t>
       </w:r>
     </w:p>
     <w:p>
@@ -13075,25 +12670,7 @@
           <w:sz w:val="22"/>
           <w:szCs w:val="22"/>
         </w:rPr>
-        <w:t xml:space="preserve">The system displays </w:t>
-      </w:r>
-      <w:proofErr w:type="gramStart"/>
-      <w:r>
-        <w:rPr>
-          <w:rFonts w:ascii="Calibri" w:hAnsi="Calibri" w:cs="Calibri"/>
-          <w:sz w:val="22"/>
-          <w:szCs w:val="22"/>
-        </w:rPr>
-        <w:t>the</w:t>
-      </w:r>
-      <w:proofErr w:type="gramEnd"/>
-      <w:r>
-        <w:rPr>
-          <w:rFonts w:ascii="Calibri" w:hAnsi="Calibri" w:cs="Calibri"/>
-          <w:sz w:val="22"/>
-          <w:szCs w:val="22"/>
-        </w:rPr>
-        <w:t xml:space="preserve"> list of previous conversations.</w:t>
+        <w:t>The system displays the list of previous conversations.</w:t>
       </w:r>
     </w:p>
     <w:p>
@@ -13340,23 +12917,13 @@
         </w:rPr>
         <w:t xml:space="preserve"> </w:t>
       </w:r>
-      <w:proofErr w:type="gramStart"/>
-      <w:r>
-        <w:rPr>
-          <w:rFonts w:ascii="Calibri" w:hAnsi="Calibri" w:cs="Calibri"/>
-          <w:sz w:val="22"/>
-          <w:szCs w:val="22"/>
-        </w:rPr>
-        <w:t>This use</w:t>
-      </w:r>
-      <w:proofErr w:type="gramEnd"/>
-      <w:r>
-        <w:rPr>
-          <w:rFonts w:ascii="Calibri" w:hAnsi="Calibri" w:cs="Calibri"/>
-          <w:sz w:val="22"/>
-          <w:szCs w:val="22"/>
-        </w:rPr>
-        <w:t xml:space="preserve"> case describes how an administrator monitors and manages system activities to ensure stable and secure operation.</w:t>
+      <w:r>
+        <w:rPr>
+          <w:rFonts w:ascii="Calibri" w:hAnsi="Calibri" w:cs="Calibri"/>
+          <w:sz w:val="22"/>
+          <w:szCs w:val="22"/>
+        </w:rPr>
+        <w:t>This use case describes how an administrator monitors and manages system activities to ensure stable and secure operation.</w:t>
       </w:r>
     </w:p>
     <w:p>
@@ -13633,25 +13200,7 @@
           <w:sz w:val="22"/>
           <w:szCs w:val="22"/>
         </w:rPr>
-        <w:t xml:space="preserve">The system applies </w:t>
-      </w:r>
-      <w:proofErr w:type="gramStart"/>
-      <w:r>
-        <w:rPr>
-          <w:rFonts w:ascii="Calibri" w:hAnsi="Calibri" w:cs="Calibri"/>
-          <w:sz w:val="22"/>
-          <w:szCs w:val="22"/>
-        </w:rPr>
-        <w:t>the administrative</w:t>
-      </w:r>
-      <w:proofErr w:type="gramEnd"/>
-      <w:r>
-        <w:rPr>
-          <w:rFonts w:ascii="Calibri" w:hAnsi="Calibri" w:cs="Calibri"/>
-          <w:sz w:val="22"/>
-          <w:szCs w:val="22"/>
-        </w:rPr>
-        <w:t xml:space="preserve"> changes.</w:t>
+        <w:t>The system applies the administrative changes.</w:t>
       </w:r>
     </w:p>
     <w:p>
@@ -13737,6 +13286,798 @@
           <w:szCs w:val="22"/>
         </w:rPr>
         <w:t>If an administrative action fails, the system logs the error and informs the administrator.</w:t>
+      </w:r>
+    </w:p>
+    <w:p>
+      <w:pPr>
+        <w:rPr>
+          <w:rFonts w:ascii="Calibri" w:hAnsi="Calibri" w:cs="Calibri"/>
+          <w:sz w:val="22"/>
+          <w:szCs w:val="22"/>
+        </w:rPr>
+      </w:pPr>
+    </w:p>
+    <w:p>
+      <w:pPr>
+        <w:pStyle w:val="Heading2"/>
+        <w:numPr>
+          <w:ilvl w:val="1"/>
+          <w:numId w:val="1"/>
+        </w:numPr>
+        <w:rPr>
+          <w:rFonts w:ascii="Calibri" w:hAnsi="Calibri" w:cs="Calibri"/>
+          <w:b/>
+          <w:bCs/>
+          <w:color w:val="auto"/>
+          <w:sz w:val="24"/>
+          <w:szCs w:val="24"/>
+        </w:rPr>
+      </w:pPr>
+      <w:r>
+        <w:rPr>
+          <w:rFonts w:ascii="Calibri" w:hAnsi="Calibri" w:cs="Calibri"/>
+          <w:b/>
+          <w:bCs/>
+          <w:color w:val="auto"/>
+          <w:sz w:val="24"/>
+          <w:szCs w:val="24"/>
+        </w:rPr>
+        <w:lastRenderedPageBreak/>
+        <w:t>External Interfaces</w:t>
+      </w:r>
+    </w:p>
+    <w:p>
+      <w:pPr>
+        <w:rPr>
+          <w:rFonts w:ascii="Calibri" w:hAnsi="Calibri" w:cs="Calibri"/>
+          <w:sz w:val="22"/>
+          <w:szCs w:val="22"/>
+        </w:rPr>
+      </w:pPr>
+      <w:r>
+        <w:rPr>
+          <w:rFonts w:ascii="Calibri" w:hAnsi="Calibri" w:cs="Calibri"/>
+          <w:sz w:val="22"/>
+          <w:szCs w:val="22"/>
+        </w:rPr>
+        <w:t>The AI-powered document retrieval system interacts with several external components that support document processing, semantic retrieval, response generation, data storage, and application deployment. These interfaces enable the system to communicate with external services while keeping the core application independent of their internal implementations. The following subsections describe the primary external interfaces used throughout the system.</w:t>
+      </w:r>
+    </w:p>
+    <w:p>
+      <w:pPr>
+        <w:pStyle w:val="Heading3"/>
+        <w:numPr>
+          <w:ilvl w:val="2"/>
+          <w:numId w:val="1"/>
+        </w:numPr>
+        <w:rPr>
+          <w:rFonts w:ascii="Calibri" w:hAnsi="Calibri" w:cs="Calibri"/>
+          <w:b/>
+          <w:bCs/>
+          <w:color w:val="auto"/>
+          <w:sz w:val="22"/>
+          <w:szCs w:val="22"/>
+        </w:rPr>
+      </w:pPr>
+      <w:r>
+        <w:rPr>
+          <w:rFonts w:ascii="Calibri" w:hAnsi="Calibri" w:cs="Calibri"/>
+          <w:b/>
+          <w:bCs/>
+          <w:color w:val="auto"/>
+          <w:sz w:val="22"/>
+          <w:szCs w:val="22"/>
+        </w:rPr>
+        <w:t>Database Interface</w:t>
+      </w:r>
+    </w:p>
+    <w:p>
+      <w:pPr>
+        <w:rPr>
+          <w:rFonts w:ascii="Calibri" w:hAnsi="Calibri" w:cs="Calibri"/>
+          <w:sz w:val="22"/>
+          <w:szCs w:val="22"/>
+        </w:rPr>
+      </w:pPr>
+      <w:r>
+        <w:rPr>
+          <w:rFonts w:ascii="Calibri" w:hAnsi="Calibri" w:cs="Calibri"/>
+          <w:sz w:val="22"/>
+          <w:szCs w:val="22"/>
+        </w:rPr>
+        <w:t>The system uses a PostgreSQL database with vector storage capabilities as its primary persistence layer. The database stores user information, uploaded document metadata, processed document chunks, conversation history, and vector embeddings generated during document processing. By separating structured application data from the application logic, the database provides efficient storage, retrieval, and indexing of information required by the retrieval pipeline.</w:t>
+      </w:r>
+    </w:p>
+    <w:p>
+      <w:pPr>
+        <w:spacing w:after="0"/>
+        <w:rPr>
+          <w:rFonts w:ascii="Calibri" w:hAnsi="Calibri" w:cs="Calibri"/>
+          <w:b/>
+          <w:bCs/>
+          <w:sz w:val="22"/>
+          <w:szCs w:val="22"/>
+        </w:rPr>
+      </w:pPr>
+      <w:r>
+        <w:rPr>
+          <w:rFonts w:ascii="Calibri" w:hAnsi="Calibri" w:cs="Calibri"/>
+          <w:b/>
+          <w:bCs/>
+          <w:noProof/>
+          <w:sz w:val="22"/>
+          <w:szCs w:val="22"/>
+        </w:rPr>
+        <w:drawing>
+          <wp:inline distT="0" distB="0" distL="0" distR="0" wp14:anchorId="307A6A3C" wp14:editId="6DF224C7">
+            <wp:extent cx="5943600" cy="3106420"/>
+            <wp:effectExtent l="0" t="0" r="0" b="0"/>
+            <wp:docPr id="260097031" name="Picture 2"/>
+            <wp:cNvGraphicFramePr>
+              <a:graphicFrameLocks xmlns:a="http://schemas.openxmlformats.org/drawingml/2006/main" noChangeAspect="1"/>
+            </wp:cNvGraphicFramePr>
+            <a:graphic xmlns:a="http://schemas.openxmlformats.org/drawingml/2006/main">
+              <a:graphicData uri="http://schemas.openxmlformats.org/drawingml/2006/picture">
+                <pic:pic xmlns:pic="http://schemas.openxmlformats.org/drawingml/2006/picture">
+                  <pic:nvPicPr>
+                    <pic:cNvPr id="260097031" name="Picture 260097031"/>
+                    <pic:cNvPicPr/>
+                  </pic:nvPicPr>
+                  <pic:blipFill>
+                    <a:blip r:embed="rId7" cstate="print">
+                      <a:extLst>
+                        <a:ext uri="{28A0092B-C50C-407E-A947-70E740481C1C}">
+                          <a14:useLocalDpi xmlns:a14="http://schemas.microsoft.com/office/drawing/2010/main" val="0"/>
+                        </a:ext>
+                      </a:extLst>
+                    </a:blip>
+                    <a:stretch>
+                      <a:fillRect/>
+                    </a:stretch>
+                  </pic:blipFill>
+                  <pic:spPr>
+                    <a:xfrm>
+                      <a:off x="0" y="0"/>
+                      <a:ext cx="5943600" cy="3106420"/>
+                    </a:xfrm>
+                    <a:prstGeom prst="rect">
+                      <a:avLst/>
+                    </a:prstGeom>
+                  </pic:spPr>
+                </pic:pic>
+              </a:graphicData>
+            </a:graphic>
+          </wp:inline>
+        </w:drawing>
+      </w:r>
+    </w:p>
+    <w:p>
+      <w:pPr>
+        <w:jc w:val="center"/>
+        <w:rPr>
+          <w:rFonts w:ascii="Calibri" w:hAnsi="Calibri" w:cs="Calibri"/>
+          <w:sz w:val="20"/>
+          <w:szCs w:val="20"/>
+        </w:rPr>
+      </w:pPr>
+      <w:r>
+        <w:rPr>
+          <w:rFonts w:ascii="Calibri" w:hAnsi="Calibri" w:cs="Calibri"/>
+          <w:b/>
+          <w:bCs/>
+          <w:sz w:val="20"/>
+          <w:szCs w:val="20"/>
+        </w:rPr>
+        <w:t>Figure 5.2:</w:t>
+      </w:r>
+      <w:r>
+        <w:rPr>
+          <w:rFonts w:ascii="Calibri" w:hAnsi="Calibri" w:cs="Calibri"/>
+          <w:sz w:val="20"/>
+          <w:szCs w:val="20"/>
+        </w:rPr>
+        <w:t xml:space="preserve"> PostgreSQL Database Interface</w:t>
+      </w:r>
+    </w:p>
+    <w:p>
+      <w:pPr>
+        <w:pStyle w:val="Heading3"/>
+        <w:numPr>
+          <w:ilvl w:val="2"/>
+          <w:numId w:val="1"/>
+        </w:numPr>
+        <w:rPr>
+          <w:rFonts w:ascii="Calibri" w:hAnsi="Calibri" w:cs="Calibri"/>
+          <w:b/>
+          <w:bCs/>
+          <w:color w:val="auto"/>
+          <w:sz w:val="22"/>
+          <w:szCs w:val="22"/>
+        </w:rPr>
+      </w:pPr>
+      <w:r>
+        <w:rPr>
+          <w:rFonts w:ascii="Calibri" w:hAnsi="Calibri" w:cs="Calibri"/>
+          <w:b/>
+          <w:bCs/>
+          <w:color w:val="auto"/>
+          <w:sz w:val="22"/>
+          <w:szCs w:val="22"/>
+        </w:rPr>
+        <w:t>Embedding Model Interface</w:t>
+      </w:r>
+    </w:p>
+    <w:p>
+      <w:pPr>
+        <w:rPr>
+          <w:rFonts w:ascii="Calibri" w:hAnsi="Calibri" w:cs="Calibri"/>
+          <w:sz w:val="22"/>
+          <w:szCs w:val="22"/>
+        </w:rPr>
+      </w:pPr>
+      <w:r>
+        <w:rPr>
+          <w:rFonts w:ascii="Calibri" w:hAnsi="Calibri" w:cs="Calibri"/>
+          <w:sz w:val="22"/>
+          <w:szCs w:val="22"/>
+        </w:rPr>
+        <w:t>The embedding model interface is responsible for transforming processed document chunks into high-dimensional vector representations. These embeddings capture the semantic meaning of the document content and enable similarity-based retrieval during user queries. The application communicates with the embedding service during the document processing pipeline, and the generated vectors are subsequently stored in the database for future retrieval operations.</w:t>
+      </w:r>
+    </w:p>
+    <w:p>
+      <w:pPr>
+        <w:rPr>
+          <w:rFonts w:ascii="Calibri" w:hAnsi="Calibri" w:cs="Calibri"/>
+          <w:b/>
+          <w:bCs/>
+          <w:sz w:val="22"/>
+          <w:szCs w:val="22"/>
+        </w:rPr>
+      </w:pPr>
+    </w:p>
+    <w:p>
+      <w:pPr>
+        <w:rPr>
+          <w:rFonts w:ascii="Calibri" w:hAnsi="Calibri" w:cs="Calibri"/>
+          <w:b/>
+          <w:bCs/>
+          <w:sz w:val="22"/>
+          <w:szCs w:val="22"/>
+        </w:rPr>
+      </w:pPr>
+    </w:p>
+    <w:p>
+      <w:pPr>
+        <w:spacing w:after="0"/>
+        <w:rPr>
+          <w:rFonts w:ascii="Calibri" w:hAnsi="Calibri" w:cs="Calibri"/>
+          <w:b/>
+          <w:bCs/>
+          <w:sz w:val="22"/>
+          <w:szCs w:val="22"/>
+        </w:rPr>
+      </w:pPr>
+      <w:r>
+        <w:rPr>
+          <w:rFonts w:ascii="Calibri" w:hAnsi="Calibri" w:cs="Calibri"/>
+          <w:b/>
+          <w:bCs/>
+          <w:noProof/>
+          <w:sz w:val="22"/>
+          <w:szCs w:val="22"/>
+        </w:rPr>
+        <w:lastRenderedPageBreak/>
+        <w:drawing>
+          <wp:inline distT="0" distB="0" distL="0" distR="0" wp14:anchorId="5B76AEF2" wp14:editId="6D8C0D85">
+            <wp:extent cx="5943600" cy="1824990"/>
+            <wp:effectExtent l="0" t="0" r="0" b="3810"/>
+            <wp:docPr id="941823059" name="Picture 3"/>
+            <wp:cNvGraphicFramePr>
+              <a:graphicFrameLocks xmlns:a="http://schemas.openxmlformats.org/drawingml/2006/main" noChangeAspect="1"/>
+            </wp:cNvGraphicFramePr>
+            <a:graphic xmlns:a="http://schemas.openxmlformats.org/drawingml/2006/main">
+              <a:graphicData uri="http://schemas.openxmlformats.org/drawingml/2006/picture">
+                <pic:pic xmlns:pic="http://schemas.openxmlformats.org/drawingml/2006/picture">
+                  <pic:nvPicPr>
+                    <pic:cNvPr id="941823059" name="Picture 941823059"/>
+                    <pic:cNvPicPr/>
+                  </pic:nvPicPr>
+                  <pic:blipFill>
+                    <a:blip r:embed="rId8">
+                      <a:extLst>
+                        <a:ext uri="{28A0092B-C50C-407E-A947-70E740481C1C}">
+                          <a14:useLocalDpi xmlns:a14="http://schemas.microsoft.com/office/drawing/2010/main" val="0"/>
+                        </a:ext>
+                      </a:extLst>
+                    </a:blip>
+                    <a:stretch>
+                      <a:fillRect/>
+                    </a:stretch>
+                  </pic:blipFill>
+                  <pic:spPr>
+                    <a:xfrm>
+                      <a:off x="0" y="0"/>
+                      <a:ext cx="5943600" cy="1824990"/>
+                    </a:xfrm>
+                    <a:prstGeom prst="rect">
+                      <a:avLst/>
+                    </a:prstGeom>
+                  </pic:spPr>
+                </pic:pic>
+              </a:graphicData>
+            </a:graphic>
+          </wp:inline>
+        </w:drawing>
+      </w:r>
+    </w:p>
+    <w:p>
+      <w:pPr>
+        <w:jc w:val="center"/>
+        <w:rPr>
+          <w:rFonts w:ascii="Calibri" w:hAnsi="Calibri" w:cs="Calibri"/>
+          <w:sz w:val="20"/>
+          <w:szCs w:val="20"/>
+        </w:rPr>
+      </w:pPr>
+      <w:r>
+        <w:rPr>
+          <w:rFonts w:ascii="Calibri" w:hAnsi="Calibri" w:cs="Calibri"/>
+          <w:b/>
+          <w:bCs/>
+          <w:sz w:val="20"/>
+          <w:szCs w:val="20"/>
+        </w:rPr>
+        <w:t>Figure 5.3:</w:t>
+      </w:r>
+      <w:r>
+        <w:rPr>
+          <w:rFonts w:ascii="Calibri" w:hAnsi="Calibri" w:cs="Calibri"/>
+          <w:sz w:val="20"/>
+          <w:szCs w:val="20"/>
+        </w:rPr>
+        <w:t xml:space="preserve"> </w:t>
+      </w:r>
+      <w:r>
+        <w:rPr>
+          <w:rFonts w:ascii="Calibri" w:hAnsi="Calibri" w:cs="Calibri"/>
+          <w:sz w:val="20"/>
+          <w:szCs w:val="20"/>
+        </w:rPr>
+        <w:t>Embedding Model Interface Used for Document Vector Generation</w:t>
+      </w:r>
+    </w:p>
+    <w:p>
+      <w:pPr>
+        <w:pStyle w:val="Heading3"/>
+        <w:numPr>
+          <w:ilvl w:val="2"/>
+          <w:numId w:val="1"/>
+        </w:numPr>
+        <w:rPr>
+          <w:rFonts w:ascii="Calibri" w:hAnsi="Calibri" w:cs="Calibri"/>
+          <w:b/>
+          <w:bCs/>
+          <w:color w:val="auto"/>
+          <w:sz w:val="22"/>
+          <w:szCs w:val="22"/>
+        </w:rPr>
+      </w:pPr>
+      <w:r>
+        <w:rPr>
+          <w:rFonts w:ascii="Calibri" w:hAnsi="Calibri" w:cs="Calibri"/>
+          <w:b/>
+          <w:bCs/>
+          <w:color w:val="auto"/>
+          <w:sz w:val="22"/>
+          <w:szCs w:val="22"/>
+        </w:rPr>
+        <w:t>Language Model Interface</w:t>
+      </w:r>
+    </w:p>
+    <w:p>
+      <w:pPr>
+        <w:rPr>
+          <w:rFonts w:ascii="Calibri" w:hAnsi="Calibri" w:cs="Calibri"/>
+          <w:sz w:val="22"/>
+          <w:szCs w:val="22"/>
+        </w:rPr>
+      </w:pPr>
+      <w:r>
+        <w:rPr>
+          <w:rFonts w:ascii="Calibri" w:hAnsi="Calibri" w:cs="Calibri"/>
+          <w:sz w:val="22"/>
+          <w:szCs w:val="22"/>
+        </w:rPr>
+        <w:t>The language model interface is used during the question-answering process. After relevant document content has been retrieved, the selected context together with the user's question is forwarded to the language model, which generates a context-aware response. The application exchanges prompts and responses through this interface while ensuring that the generated answer is based on the retrieved document context.</w:t>
+      </w:r>
+    </w:p>
+    <w:p>
+      <w:pPr>
+        <w:spacing w:after="0"/>
+        <w:rPr>
+          <w:rFonts w:ascii="Calibri" w:hAnsi="Calibri" w:cs="Calibri"/>
+          <w:b/>
+          <w:bCs/>
+          <w:sz w:val="22"/>
+          <w:szCs w:val="22"/>
+        </w:rPr>
+      </w:pPr>
+      <w:r>
+        <w:rPr>
+          <w:rFonts w:ascii="Calibri" w:hAnsi="Calibri" w:cs="Calibri"/>
+          <w:b/>
+          <w:bCs/>
+          <w:noProof/>
+          <w:sz w:val="22"/>
+          <w:szCs w:val="22"/>
+        </w:rPr>
+        <w:drawing>
+          <wp:inline distT="0" distB="0" distL="0" distR="0" wp14:anchorId="2F850680" wp14:editId="02B8CAAE">
+            <wp:extent cx="5943600" cy="3533140"/>
+            <wp:effectExtent l="0" t="0" r="0" b="0"/>
+            <wp:docPr id="1673314817" name="Picture 4"/>
+            <wp:cNvGraphicFramePr>
+              <a:graphicFrameLocks xmlns:a="http://schemas.openxmlformats.org/drawingml/2006/main" noChangeAspect="1"/>
+            </wp:cNvGraphicFramePr>
+            <a:graphic xmlns:a="http://schemas.openxmlformats.org/drawingml/2006/main">
+              <a:graphicData uri="http://schemas.openxmlformats.org/drawingml/2006/picture">
+                <pic:pic xmlns:pic="http://schemas.openxmlformats.org/drawingml/2006/picture">
+                  <pic:nvPicPr>
+                    <pic:cNvPr id="1673314817" name="Picture 1673314817"/>
+                    <pic:cNvPicPr/>
+                  </pic:nvPicPr>
+                  <pic:blipFill>
+                    <a:blip r:embed="rId9">
+                      <a:extLst>
+                        <a:ext uri="{28A0092B-C50C-407E-A947-70E740481C1C}">
+                          <a14:useLocalDpi xmlns:a14="http://schemas.microsoft.com/office/drawing/2010/main" val="0"/>
+                        </a:ext>
+                      </a:extLst>
+                    </a:blip>
+                    <a:stretch>
+                      <a:fillRect/>
+                    </a:stretch>
+                  </pic:blipFill>
+                  <pic:spPr>
+                    <a:xfrm>
+                      <a:off x="0" y="0"/>
+                      <a:ext cx="5943600" cy="3533140"/>
+                    </a:xfrm>
+                    <a:prstGeom prst="rect">
+                      <a:avLst/>
+                    </a:prstGeom>
+                  </pic:spPr>
+                </pic:pic>
+              </a:graphicData>
+            </a:graphic>
+          </wp:inline>
+        </w:drawing>
+      </w:r>
+    </w:p>
+    <w:p>
+      <w:pPr>
+        <w:jc w:val="center"/>
+        <w:rPr>
+          <w:rFonts w:ascii="Calibri" w:hAnsi="Calibri" w:cs="Calibri"/>
+          <w:sz w:val="20"/>
+          <w:szCs w:val="20"/>
+        </w:rPr>
+      </w:pPr>
+      <w:r>
+        <w:rPr>
+          <w:rFonts w:ascii="Calibri" w:hAnsi="Calibri" w:cs="Calibri"/>
+          <w:b/>
+          <w:bCs/>
+          <w:sz w:val="20"/>
+          <w:szCs w:val="20"/>
+        </w:rPr>
+        <w:t>Figure 5.4:</w:t>
+      </w:r>
+      <w:r>
+        <w:rPr>
+          <w:rFonts w:ascii="Calibri" w:hAnsi="Calibri" w:cs="Calibri"/>
+          <w:sz w:val="20"/>
+          <w:szCs w:val="20"/>
+        </w:rPr>
+        <w:t xml:space="preserve"> </w:t>
+      </w:r>
+      <w:r>
+        <w:rPr>
+          <w:rFonts w:ascii="Calibri" w:hAnsi="Calibri" w:cs="Calibri"/>
+          <w:sz w:val="20"/>
+          <w:szCs w:val="20"/>
+        </w:rPr>
+        <w:t>Language Model Interface Used for Context-Aware Response Generation</w:t>
+      </w:r>
+    </w:p>
+    <w:p>
+      <w:pPr>
+        <w:pStyle w:val="Heading3"/>
+        <w:numPr>
+          <w:ilvl w:val="2"/>
+          <w:numId w:val="1"/>
+        </w:numPr>
+        <w:rPr>
+          <w:rFonts w:ascii="Calibri" w:hAnsi="Calibri" w:cs="Calibri"/>
+          <w:b/>
+          <w:bCs/>
+          <w:color w:val="auto"/>
+          <w:sz w:val="22"/>
+          <w:szCs w:val="22"/>
+        </w:rPr>
+      </w:pPr>
+      <w:r>
+        <w:rPr>
+          <w:rFonts w:ascii="Calibri" w:hAnsi="Calibri" w:cs="Calibri"/>
+          <w:b/>
+          <w:bCs/>
+          <w:color w:val="auto"/>
+          <w:sz w:val="22"/>
+          <w:szCs w:val="22"/>
+        </w:rPr>
+        <w:t>Background Processing Interface</w:t>
+      </w:r>
+    </w:p>
+    <w:p>
+      <w:pPr>
+        <w:rPr>
+          <w:rFonts w:ascii="Calibri" w:hAnsi="Calibri" w:cs="Calibri"/>
+          <w:sz w:val="22"/>
+          <w:szCs w:val="22"/>
+        </w:rPr>
+      </w:pPr>
+      <w:r>
+        <w:rPr>
+          <w:rFonts w:ascii="Calibri" w:hAnsi="Calibri" w:cs="Calibri"/>
+          <w:sz w:val="22"/>
+          <w:szCs w:val="22"/>
+        </w:rPr>
+        <w:t xml:space="preserve">Document processing is performed asynchronously through a background job processing mechanism. After a document is uploaded, the system automatically schedules a series of processing jobs responsible for text extraction, document chunking, embedding generation, and database storage. Executing these </w:t>
+      </w:r>
+      <w:r>
+        <w:rPr>
+          <w:rFonts w:ascii="Calibri" w:hAnsi="Calibri" w:cs="Calibri"/>
+          <w:sz w:val="22"/>
+          <w:szCs w:val="22"/>
+        </w:rPr>
+        <w:lastRenderedPageBreak/>
+        <w:t>operations in the background prevents long-running tasks from blocking user interactions and allows users to monitor processing progress while the application continues operating normally.</w:t>
+      </w:r>
+    </w:p>
+    <w:p>
+      <w:pPr>
+        <w:spacing w:after="0"/>
+        <w:rPr>
+          <w:rFonts w:ascii="Calibri" w:hAnsi="Calibri" w:cs="Calibri"/>
+          <w:b/>
+          <w:bCs/>
+          <w:sz w:val="22"/>
+          <w:szCs w:val="22"/>
+        </w:rPr>
+      </w:pPr>
+      <w:r>
+        <w:rPr>
+          <w:rFonts w:ascii="Calibri" w:hAnsi="Calibri" w:cs="Calibri"/>
+          <w:b/>
+          <w:bCs/>
+          <w:noProof/>
+          <w:sz w:val="22"/>
+          <w:szCs w:val="22"/>
+        </w:rPr>
+        <w:drawing>
+          <wp:inline distT="0" distB="0" distL="0" distR="0" wp14:anchorId="5CC81DC2" wp14:editId="57779A9C">
+            <wp:extent cx="5943600" cy="1257300"/>
+            <wp:effectExtent l="0" t="0" r="0" b="0"/>
+            <wp:docPr id="524178447" name="Picture 5"/>
+            <wp:cNvGraphicFramePr>
+              <a:graphicFrameLocks xmlns:a="http://schemas.openxmlformats.org/drawingml/2006/main" noChangeAspect="1"/>
+            </wp:cNvGraphicFramePr>
+            <a:graphic xmlns:a="http://schemas.openxmlformats.org/drawingml/2006/main">
+              <a:graphicData uri="http://schemas.openxmlformats.org/drawingml/2006/picture">
+                <pic:pic xmlns:pic="http://schemas.openxmlformats.org/drawingml/2006/picture">
+                  <pic:nvPicPr>
+                    <pic:cNvPr id="524178447" name="Picture 524178447"/>
+                    <pic:cNvPicPr/>
+                  </pic:nvPicPr>
+                  <pic:blipFill rotWithShape="1">
+                    <a:blip r:embed="rId10">
+                      <a:extLst>
+                        <a:ext uri="{28A0092B-C50C-407E-A947-70E740481C1C}">
+                          <a14:useLocalDpi xmlns:a14="http://schemas.microsoft.com/office/drawing/2010/main" val="0"/>
+                        </a:ext>
+                      </a:extLst>
+                    </a:blip>
+                    <a:srcRect t="1" b="18012"/>
+                    <a:stretch>
+                      <a:fillRect/>
+                    </a:stretch>
+                  </pic:blipFill>
+                  <pic:spPr bwMode="auto">
+                    <a:xfrm>
+                      <a:off x="0" y="0"/>
+                      <a:ext cx="5943600" cy="1257300"/>
+                    </a:xfrm>
+                    <a:prstGeom prst="rect">
+                      <a:avLst/>
+                    </a:prstGeom>
+                    <a:ln>
+                      <a:noFill/>
+                    </a:ln>
+                    <a:extLst>
+                      <a:ext uri="{53640926-AAD7-44D8-BBD7-CCE9431645EC}">
+                        <a14:shadowObscured xmlns:a14="http://schemas.microsoft.com/office/drawing/2010/main"/>
+                      </a:ext>
+                    </a:extLst>
+                  </pic:spPr>
+                </pic:pic>
+              </a:graphicData>
+            </a:graphic>
+          </wp:inline>
+        </w:drawing>
+      </w:r>
+    </w:p>
+    <w:p>
+      <w:pPr>
+        <w:jc w:val="center"/>
+        <w:rPr>
+          <w:rFonts w:ascii="Calibri" w:hAnsi="Calibri" w:cs="Calibri"/>
+          <w:sz w:val="20"/>
+          <w:szCs w:val="20"/>
+        </w:rPr>
+      </w:pPr>
+      <w:r>
+        <w:rPr>
+          <w:rFonts w:ascii="Calibri" w:hAnsi="Calibri" w:cs="Calibri"/>
+          <w:b/>
+          <w:bCs/>
+          <w:sz w:val="20"/>
+          <w:szCs w:val="20"/>
+        </w:rPr>
+        <w:t>Figure 5.5:</w:t>
+      </w:r>
+      <w:r>
+        <w:rPr>
+          <w:rFonts w:ascii="Calibri" w:hAnsi="Calibri" w:cs="Calibri"/>
+          <w:sz w:val="20"/>
+          <w:szCs w:val="20"/>
+        </w:rPr>
+        <w:t xml:space="preserve"> Background Job Processing Interface</w:t>
+      </w:r>
+    </w:p>
+    <w:p>
+      <w:pPr>
+        <w:pStyle w:val="Heading3"/>
+        <w:numPr>
+          <w:ilvl w:val="2"/>
+          <w:numId w:val="1"/>
+        </w:numPr>
+        <w:rPr>
+          <w:rFonts w:ascii="Calibri" w:hAnsi="Calibri" w:cs="Calibri"/>
+          <w:b/>
+          <w:bCs/>
+          <w:color w:val="auto"/>
+          <w:sz w:val="22"/>
+          <w:szCs w:val="22"/>
+        </w:rPr>
+      </w:pPr>
+      <w:r>
+        <w:rPr>
+          <w:rFonts w:ascii="Calibri" w:hAnsi="Calibri" w:cs="Calibri"/>
+          <w:b/>
+          <w:bCs/>
+          <w:color w:val="auto"/>
+          <w:sz w:val="22"/>
+          <w:szCs w:val="22"/>
+        </w:rPr>
+        <w:t>Containerization Interface</w:t>
+      </w:r>
+    </w:p>
+    <w:p>
+      <w:pPr>
+        <w:rPr>
+          <w:rFonts w:ascii="Calibri" w:hAnsi="Calibri" w:cs="Calibri"/>
+          <w:sz w:val="22"/>
+          <w:szCs w:val="22"/>
+        </w:rPr>
+      </w:pPr>
+      <w:r>
+        <w:rPr>
+          <w:rFonts w:ascii="Calibri" w:hAnsi="Calibri" w:cs="Calibri"/>
+          <w:sz w:val="22"/>
+          <w:szCs w:val="22"/>
+        </w:rPr>
+        <w:t>To simplify development, deployment, and environment consistency, the application is containerized using Docker. Individual containers are used to isolate the web application, database, web server, and background processing services while allowing them to communicate through a shared container network. This containerized architecture ensures that the application can be deployed consistently across different development and production environments with minimal configuration changes.</w:t>
+      </w:r>
+    </w:p>
+    <w:p>
+      <w:pPr>
+        <w:spacing w:after="0"/>
+        <w:rPr>
+          <w:rFonts w:ascii="Calibri" w:hAnsi="Calibri" w:cs="Calibri"/>
+          <w:b/>
+          <w:bCs/>
+          <w:sz w:val="22"/>
+          <w:szCs w:val="22"/>
+        </w:rPr>
+      </w:pPr>
+      <w:r>
+        <w:rPr>
+          <w:rFonts w:ascii="Calibri" w:hAnsi="Calibri" w:cs="Calibri"/>
+          <w:b/>
+          <w:bCs/>
+          <w:noProof/>
+          <w:sz w:val="22"/>
+          <w:szCs w:val="22"/>
+        </w:rPr>
+        <w:drawing>
+          <wp:inline distT="0" distB="0" distL="0" distR="0" wp14:anchorId="6E677B39" wp14:editId="424D1CA4">
+            <wp:extent cx="5943600" cy="3130550"/>
+            <wp:effectExtent l="0" t="0" r="0" b="0"/>
+            <wp:docPr id="592458548" name="Picture 6"/>
+            <wp:cNvGraphicFramePr>
+              <a:graphicFrameLocks xmlns:a="http://schemas.openxmlformats.org/drawingml/2006/main" noChangeAspect="1"/>
+            </wp:cNvGraphicFramePr>
+            <a:graphic xmlns:a="http://schemas.openxmlformats.org/drawingml/2006/main">
+              <a:graphicData uri="http://schemas.openxmlformats.org/drawingml/2006/picture">
+                <pic:pic xmlns:pic="http://schemas.openxmlformats.org/drawingml/2006/picture">
+                  <pic:nvPicPr>
+                    <pic:cNvPr id="592458548" name="Picture 592458548"/>
+                    <pic:cNvPicPr/>
+                  </pic:nvPicPr>
+                  <pic:blipFill>
+                    <a:blip r:embed="rId11" cstate="print">
+                      <a:extLst>
+                        <a:ext uri="{28A0092B-C50C-407E-A947-70E740481C1C}">
+                          <a14:useLocalDpi xmlns:a14="http://schemas.microsoft.com/office/drawing/2010/main" val="0"/>
+                        </a:ext>
+                      </a:extLst>
+                    </a:blip>
+                    <a:stretch>
+                      <a:fillRect/>
+                    </a:stretch>
+                  </pic:blipFill>
+                  <pic:spPr>
+                    <a:xfrm>
+                      <a:off x="0" y="0"/>
+                      <a:ext cx="5943600" cy="3130550"/>
+                    </a:xfrm>
+                    <a:prstGeom prst="rect">
+                      <a:avLst/>
+                    </a:prstGeom>
+                  </pic:spPr>
+                </pic:pic>
+              </a:graphicData>
+            </a:graphic>
+          </wp:inline>
+        </w:drawing>
+      </w:r>
+    </w:p>
+    <w:p>
+      <w:pPr>
+        <w:jc w:val="center"/>
+        <w:rPr>
+          <w:rFonts w:ascii="Calibri" w:hAnsi="Calibri" w:cs="Calibri"/>
+          <w:sz w:val="20"/>
+          <w:szCs w:val="20"/>
+        </w:rPr>
+      </w:pPr>
+      <w:r>
+        <w:rPr>
+          <w:rFonts w:ascii="Calibri" w:hAnsi="Calibri" w:cs="Calibri"/>
+          <w:b/>
+          <w:bCs/>
+          <w:sz w:val="20"/>
+          <w:szCs w:val="20"/>
+        </w:rPr>
+        <w:t>Figure 5.6:</w:t>
+      </w:r>
+      <w:r>
+        <w:rPr>
+          <w:rFonts w:ascii="Calibri" w:hAnsi="Calibri" w:cs="Calibri"/>
+          <w:sz w:val="20"/>
+          <w:szCs w:val="20"/>
+        </w:rPr>
+        <w:t xml:space="preserve"> Docker Container Environment</w:t>
       </w:r>
     </w:p>
     <w:p>
@@ -21729,7 +22070,6 @@
     <w:next w:val="Normal"/>
     <w:link w:val="Heading3Char"/>
     <w:uiPriority w:val="9"/>
-    <w:semiHidden/>
     <w:unhideWhenUsed/>
     <w:qFormat/>
     <w:rsid w:val="00163B84"/>
@@ -21935,7 +22275,6 @@
     <w:basedOn w:val="DefaultParagraphFont"/>
     <w:link w:val="Heading3"/>
     <w:uiPriority w:val="9"/>
-    <w:semiHidden/>
     <w:rsid w:val="00163B84"/>
     <w:rPr>
       <w:rFonts w:eastAsiaTheme="majorEastAsia" w:cstheme="majorBidi"/>

</xml_diff>